<commit_message>
Mise à jour du compte rendu : ajout résultats erreur SSL sans keystore + test navigateur
Co-authored-by: ibragaaa <ibragaaa@users.noreply.github.com>
</commit_message>
<xml_diff>
--- a/compte_rendu_TP_chiffrement_java.docx
+++ b/compte_rendu_TP_chiffrement_java.docx
@@ -992,7 +992,36 @@
     </w:p>
     <w:p>
       <w:r>
-        <w:t>Si on compile et exécute le programme directement sans spécifier de keystore, le serveur ne peut pas démarrer correctement car il n'a pas de certificat SSL à présenter aux clients. On obtient une erreur liée à l'absence de keystore.</w:t>
+        <w:t>Si on compile et exécute le programme directement sans spécifier de keystore, le serveur démarre mais ne peut pas établir de connexion SSL avec les clients. Quand un client tente de se connecter, on obtient l'erreur suivante :</w:t>
+      </w:r>
+    </w:p>
+    <w:p>
+      <w:r>
+        <w:rPr>
+          <w:rFonts w:ascii="Consolas" w:hAnsi="Consolas"/>
+          <w:sz w:val="18"/>
+        </w:rPr>
+        <w:t>$ javac HTTPSServerExample_01.java</w:t>
+        <w:br/>
+        <w:t>$ java HTTPSServerExample_01</w:t>
+        <w:br/>
+        <w:br/>
+        <w:t>Client connection made</w:t>
+        <w:br/>
+        <w:t>javax.net.ssl.SSLHandshakeException:</w:t>
+        <w:br/>
+        <w:t xml:space="preserve">  (handshake_failure) No available authentication scheme</w:t>
+        <w:br/>
+        <w:t xml:space="preserve">  at sun.security.ssl.Alert.createSSLException(Alert.java:130)</w:t>
+        <w:br/>
+        <w:t xml:space="preserve">  at sun.security.ssl.TransportContext.fatal(...)</w:t>
+        <w:br/>
+        <w:t xml:space="preserve">  ...</w:t>
+      </w:r>
+    </w:p>
+    <w:p>
+      <w:r>
+        <w:t>Le serveur accepte la connexion TCP mais échoue lors du handshake SSL car il n'a aucun certificat à présenter au client. L'erreur « No available authentication scheme » indique qu'il n'existe aucun mécanisme d'authentification disponible sans keystore. Côté client (curl ou navigateur), on obtient une erreur « sslv3 alert handshake failure ».</w:t>
       </w:r>
     </w:p>
     <w:p>
@@ -1061,12 +1090,17 @@
     </w:p>
     <w:p>
       <w:r>
-        <w:t>En ouvrant Firefox à l'adresse https://localhost:12345, on obtient un avertissement de sécurité : « Warning: Potential Security Risk Ahead ». C'est normal car le certificat est auto-signé et n'a pas été émis par une autorité de certification reconnue. Le navigateur ne peut pas vérifier l'identité du serveur.</w:t>
+        <w:t>En ouvrant le navigateur à l'adresse https://localhost:12345, on obtient un avertissement de sécurité : « Your connection is not private » avec le code d'erreur NET::ERR_CERT_AUTHORITY_INVALID. C'est normal car le certificat est auto-signé et n'a pas été émis par une autorité de certification reconnue. Le navigateur ne peut pas vérifier l'identité du serveur. La barre d'adresse affiche « Not secure » en rouge.</w:t>
       </w:r>
     </w:p>
     <w:p>
       <w:r>
-        <w:t>En acceptant le risque et en ajoutant une exception de sécurité, on peut finalement se connecter au serveur et on voit la page HTML avec le message « Hello Students ». Le serveur affiche aussi dans la console « Client connection made » et la requête GET du navigateur.</w:t>
+        <w:t>En cliquant sur « Advanced » (Avancé), le navigateur affiche un message supplémentaire : « This server could not prove that it is localhost; its security certificate is not trusted by your computer's operating system. » avec un lien « Proceed to localhost (unsafe) ».</w:t>
+      </w:r>
+    </w:p>
+    <w:p>
+      <w:r>
+        <w:t>En acceptant le risque et en cliquant sur ce lien, on peut finalement se connecter au serveur et on voit la page HTML avec le message « Hello Students » en titre H1. Le serveur affiche dans la console « Client connection made » et la requête GET du navigateur. La connexion HTTPS est bien établie malgré le certificat auto-signé.</w:t>
       </w:r>
     </w:p>
     <w:p>

</xml_diff>